<commit_message>
clened up new employee entry. added individual hour entry table. started pay calculation
</commit_message>
<xml_diff>
--- a/Project Plan - Jacob Strauch.docx
+++ b/Project Plan - Jacob Strauch.docx
@@ -557,7 +557,13 @@
         </w:numPr>
       </w:pPr>
       <w:r>
-        <w:t>Employee id as PK</w:t>
+        <w:t>Employee id</w:t>
+      </w:r>
+      <w:r>
+        <w:t>, auto generated based off highest id in system,</w:t>
+      </w:r>
+      <w:r>
+        <w:t xml:space="preserve"> as PK</w:t>
       </w:r>
     </w:p>
     <w:p>
@@ -812,6 +818,7 @@
         </w:numPr>
       </w:pPr>
       <w:r>
+        <w:lastRenderedPageBreak/>
         <w:t>HR0001</w:t>
       </w:r>
     </w:p>
@@ -824,92 +831,91 @@
         </w:numPr>
       </w:pPr>
       <w:r>
+        <w:t>Secure password of my choice</w:t>
+      </w:r>
+    </w:p>
+    <w:p>
+      <w:pPr>
+        <w:pStyle w:val="ListParagraph"/>
+        <w:numPr>
+          <w:ilvl w:val="1"/>
+          <w:numId w:val="1"/>
+        </w:numPr>
+      </w:pPr>
+      <w:r>
+        <w:t>Build test log</w:t>
+      </w:r>
+    </w:p>
+    <w:p>
+      <w:pPr>
+        <w:pStyle w:val="ListParagraph"/>
+        <w:numPr>
+          <w:ilvl w:val="2"/>
+          <w:numId w:val="1"/>
+        </w:numPr>
+      </w:pPr>
+      <w:r>
+        <w:t>Empty log should be stored in github</w:t>
+      </w:r>
+    </w:p>
+    <w:p>
+      <w:pPr>
+        <w:pStyle w:val="ListParagraph"/>
+        <w:numPr>
+          <w:ilvl w:val="2"/>
+          <w:numId w:val="1"/>
+        </w:numPr>
+      </w:pPr>
+      <w:r>
+        <w:t>Complete all tests with provided screenshots and explanations</w:t>
+      </w:r>
+    </w:p>
+    <w:p>
+      <w:pPr>
+        <w:pStyle w:val="ListParagraph"/>
+        <w:numPr>
+          <w:ilvl w:val="0"/>
+          <w:numId w:val="1"/>
+        </w:numPr>
+      </w:pPr>
+      <w:r>
+        <w:t>Once everything is working how it should, I need to write up a user-friendly document that explains how all the features work for the employees that will be using the application</w:t>
+      </w:r>
+    </w:p>
+    <w:p/>
+    <w:p>
+      <w:r>
+        <w:t>Some other key points of focus throughout the production of this project are as follows:</w:t>
+      </w:r>
+    </w:p>
+    <w:p>
+      <w:r>
+        <w:t xml:space="preserve">Algorithms- This is the algorithm class so I need to </w:t>
+      </w:r>
+      <w:r>
+        <w:t>use some the concepts that we have learned about throughout the course to make this project. For the bulk of my data I am using sqlite databases to store it. Sqlite uses b trees to organize and search data when I input my SQL queries. Another algorithm I am using in the program is the sha256 hashing algorithm. This is the hashing algorithm I am using to safely store my passwords in the database. I am also using stacks and lists in the construction of some of the components on different pages in the project.</w:t>
+      </w:r>
+    </w:p>
+    <w:p>
+      <w:r>
+        <w:t>Programming Standards – In this project I have tried to apply as many concepts and standard practices as possible. I built the pages as modules so that everything is organized and easy to find. For data heavy object that is the employee I created a data class that can more easily store all the needed information for an individual employee. The standard for tkinter pages is to create each page for the window as a class</w:t>
+      </w:r>
+      <w:r>
+        <w:t>. I followed that and made all the windows subframes to my main frame that is locked at a size appropriate for the data that needs to be displayed. I also used checks on the input data to ensure it was appropriate for the field being entered. I did checks to make sure the field had input as well as the content size and type where appropriate.</w:t>
+      </w:r>
+    </w:p>
+    <w:p>
+      <w:r>
+        <w:t>Standard Libraries – I used many standard libraries to complete this project. Hashlib allowed me to use the sha256 hashing algorithm easily. Tkinter is a standard python library that the whole app is built on top of. I used the datetime library to get better formatting for the dates I needed on the employee details section as well as for the dates of hours logged for payroll. Also sqlite3 is a standard library that allowed me to use the compact database structure that stored all the persistent data for this project.</w:t>
+      </w:r>
+    </w:p>
+    <w:p>
+      <w:r>
+        <w:t xml:space="preserve">Security – In order to secure the data on this app, I have taken a few steps. Firstly I have stored the user passwords as hashes so that if there was a data breach, the actual passwords would not be compromised. Then I have implemented a least access policy </w:t>
+      </w:r>
+      <w:r>
         <w:lastRenderedPageBreak/>
-        <w:t>Secure password of my choice</w:t>
-      </w:r>
-    </w:p>
-    <w:p>
-      <w:pPr>
-        <w:pStyle w:val="ListParagraph"/>
-        <w:numPr>
-          <w:ilvl w:val="1"/>
-          <w:numId w:val="1"/>
-        </w:numPr>
-      </w:pPr>
-      <w:r>
-        <w:t>Build test log</w:t>
-      </w:r>
-    </w:p>
-    <w:p>
-      <w:pPr>
-        <w:pStyle w:val="ListParagraph"/>
-        <w:numPr>
-          <w:ilvl w:val="2"/>
-          <w:numId w:val="1"/>
-        </w:numPr>
-      </w:pPr>
-      <w:r>
-        <w:t>Empty log should be stored in github</w:t>
-      </w:r>
-    </w:p>
-    <w:p>
-      <w:pPr>
-        <w:pStyle w:val="ListParagraph"/>
-        <w:numPr>
-          <w:ilvl w:val="2"/>
-          <w:numId w:val="1"/>
-        </w:numPr>
-      </w:pPr>
-      <w:r>
-        <w:t>Complete all tests with provided screenshots and explanations</w:t>
-      </w:r>
-    </w:p>
-    <w:p>
-      <w:pPr>
-        <w:pStyle w:val="ListParagraph"/>
-        <w:numPr>
-          <w:ilvl w:val="0"/>
-          <w:numId w:val="1"/>
-        </w:numPr>
-      </w:pPr>
-      <w:r>
-        <w:t>Once everything is working how it should, I need to write up a user-friendly document that explains how all the features work for the employees that will be using the application</w:t>
-      </w:r>
-    </w:p>
-    <w:p/>
-    <w:p>
-      <w:r>
-        <w:t>Some other key points of focus throughout the production of this project are as follows:</w:t>
-      </w:r>
-    </w:p>
-    <w:p>
-      <w:r>
-        <w:t xml:space="preserve">Algorithms- This is the algorithm class so I need to </w:t>
-      </w:r>
-      <w:r>
-        <w:t>use some the concepts that we have learned about throughout the course to make this project. For the bulk of my data I am using sqlite databases to store it. Sqlite uses b trees to organize and search data when I input my SQL queries. Another algorithm I am using in the program is the sha256 hashing algorithm. This is the hashing algorithm I am using to safely store my passwords in the database. I am also using stacks and lists in the construction of some of the components on different pages in the project.</w:t>
-      </w:r>
-    </w:p>
-    <w:p>
-      <w:r>
-        <w:t>Programming Standards – In this project I have tried to apply as many concepts and standard practices as possible. I built the pages as modules so that everything is organized and easy to find. For data heavy object that is the employee I created a data class that can more easily store all the needed information for an individual employee. The standard for tkinter pages is to create each page for the window as a class</w:t>
-      </w:r>
-      <w:r>
-        <w:t>. I followed that and made all the windows subframes to my main frame that is locked at a size appropriate for the data that needs to be displayed. I also used checks on the input data to ensure it was appropriate for the field being entered. I did checks to make sure the field had input as well as the content size and type where appropriate.</w:t>
-      </w:r>
-    </w:p>
-    <w:p>
-      <w:r>
-        <w:t>Standard Libraries – I used many standard libraries to complete this project. Hashlib allowed me to use the sha256 hashing algorithm easily. Tkinter is a standard python library that the whole app is built on top of. I used the datetime library to get better formatting for the dates I needed on the employee details section as well as for the dates of hours logged for payroll. Also sqlite3 is a standard library that allowed me to use the compact database structure that stored all the persistent data for this project.</w:t>
-      </w:r>
-    </w:p>
-    <w:p>
-      <w:r>
-        <w:t xml:space="preserve">Security – In order to secure the data on this app, I have taken a few steps. Firstly I have stored the user passwords as hashes so that if there was a data breach, the actual passwords would not be compromised. Then I have implemented a least access policy where in the standard employee only has access to their hour checking. There is no way for </w:t>
-      </w:r>
-      <w:r>
-        <w:lastRenderedPageBreak/>
-        <w:t>them to even try to access another users data by normal means. I have also taken precautions against SQL injection by not using direct concatenation in my SQL queries.</w:t>
+        <w:t>where in the standard employee only has access to their hour checking. There is no way for them to even try to access another users data by normal means. I have also taken precautions against SQL injection by not using direct concatenation in my SQL queries.</w:t>
       </w:r>
     </w:p>
     <w:sectPr>

</xml_diff>